<commit_message>
ajuste en la plantilla creacion de la interfaz
</commit_message>
<xml_diff>
--- a/template.docx
+++ b/template.docx
@@ -889,15 +889,15 @@
         <w:tblLook w:val="04a0" w:firstRow="1" w:noVBand="1" w:lastRow="0" w:firstColumn="1" w:lastColumn="0" w:noHBand="0"/>
       </w:tblPr>
       <w:tblGrid>
-        <w:gridCol w:w="8188"/>
+        <w:gridCol w:w="8187"/>
         <w:gridCol w:w="979"/>
-        <w:gridCol w:w="1033"/>
+        <w:gridCol w:w="1034"/>
       </w:tblGrid>
       <w:tr>
         <w:trPr/>
         <w:tc>
           <w:tcPr>
-            <w:tcW w:w="8188" w:type="dxa"/>
+            <w:tcW w:w="8187" w:type="dxa"/>
             <w:tcBorders>
               <w:top w:val="nil"/>
               <w:start w:val="nil"/>
@@ -963,7 +963,7 @@
         </w:tc>
         <w:tc>
           <w:tcPr>
-            <w:tcW w:w="1033" w:type="dxa"/>
+            <w:tcW w:w="1034" w:type="dxa"/>
             <w:tcBorders>
               <w:top w:val="nil"/>
               <w:start w:val="nil"/>
@@ -1002,7 +1002,7 @@
         <w:trPr/>
         <w:tc>
           <w:tcPr>
-            <w:tcW w:w="9167" w:type="dxa"/>
+            <w:tcW w:w="9166" w:type="dxa"/>
             <w:gridSpan w:val="2"/>
             <w:tcBorders>
               <w:top w:val="nil"/>
@@ -1040,7 +1040,7 @@
         </w:tc>
         <w:tc>
           <w:tcPr>
-            <w:tcW w:w="1033" w:type="dxa"/>
+            <w:tcW w:w="1034" w:type="dxa"/>
             <w:tcBorders>
               <w:top w:val="nil"/>
               <w:start w:val="nil"/>
@@ -1076,7 +1076,7 @@
         <w:trPr/>
         <w:tc>
           <w:tcPr>
-            <w:tcW w:w="8188" w:type="dxa"/>
+            <w:tcW w:w="8187" w:type="dxa"/>
             <w:tcBorders>
               <w:top w:val="nil"/>
               <w:start w:val="nil"/>
@@ -1142,7 +1142,7 @@
         </w:tc>
         <w:tc>
           <w:tcPr>
-            <w:tcW w:w="1033" w:type="dxa"/>
+            <w:tcW w:w="1034" w:type="dxa"/>
             <w:tcBorders>
               <w:top w:val="nil"/>
               <w:start w:val="nil"/>
@@ -1178,7 +1178,7 @@
         <w:trPr/>
         <w:tc>
           <w:tcPr>
-            <w:tcW w:w="8188" w:type="dxa"/>
+            <w:tcW w:w="8187" w:type="dxa"/>
             <w:tcBorders>
               <w:top w:val="nil"/>
               <w:start w:val="nil"/>
@@ -1248,7 +1248,7 @@
         </w:tc>
         <w:tc>
           <w:tcPr>
-            <w:tcW w:w="1033" w:type="dxa"/>
+            <w:tcW w:w="1034" w:type="dxa"/>
             <w:tcBorders>
               <w:top w:val="nil"/>
               <w:start w:val="nil"/>
@@ -1284,7 +1284,7 @@
         <w:trPr/>
         <w:tc>
           <w:tcPr>
-            <w:tcW w:w="9167" w:type="dxa"/>
+            <w:tcW w:w="9166" w:type="dxa"/>
             <w:gridSpan w:val="2"/>
             <w:tcBorders>
               <w:top w:val="nil"/>
@@ -1322,7 +1322,7 @@
         </w:tc>
         <w:tc>
           <w:tcPr>
-            <w:tcW w:w="1033" w:type="dxa"/>
+            <w:tcW w:w="1034" w:type="dxa"/>
             <w:tcBorders>
               <w:top w:val="nil"/>
               <w:start w:val="nil"/>
@@ -1360,7 +1360,7 @@
         </w:trPr>
         <w:tc>
           <w:tcPr>
-            <w:tcW w:w="8188" w:type="dxa"/>
+            <w:tcW w:w="8187" w:type="dxa"/>
             <w:tcBorders>
               <w:top w:val="nil"/>
               <w:start w:val="nil"/>
@@ -1428,7 +1428,7 @@
         </w:tc>
         <w:tc>
           <w:tcPr>
-            <w:tcW w:w="1033" w:type="dxa"/>
+            <w:tcW w:w="1034" w:type="dxa"/>
             <w:tcBorders>
               <w:top w:val="nil"/>
               <w:start w:val="nil"/>
@@ -4285,37 +4285,7 @@
         </w:rPr>
       </w:pPr>
       <w:r>
-        <w:rPr>
-          <w:rFonts w:cs="Arial" w:ascii="Arial" w:hAnsi="Arial"/>
-          <w:b w:val="false"/>
-          <w:sz w:val="22"/>
-          <w:szCs w:val="22"/>
-        </w:rPr>
-      </w:r>
-    </w:p>
-    <w:p>
-      <w:pPr>
-        <w:pStyle w:val="Normal"/>
-        <w:spacing w:lineRule="auto" w:line="276" w:before="0" w:after="200"/>
-        <w:contextualSpacing/>
-        <w:jc w:val="both"/>
-        <w:rPr>
-          <w:rFonts w:ascii="Arial" w:hAnsi="Arial" w:cs="Arial"/>
-          <w:b w:val="false"/>
-          <w:color w:val="FF0000"/>
-          <w:sz w:val="22"/>
-          <w:szCs w:val="22"/>
-        </w:rPr>
-      </w:pPr>
-      <w:r>
-        <w:rPr>
-          <w:rFonts w:cs="Arial" w:ascii="Arial" w:hAnsi="Arial"/>
-          <w:b w:val="false"/>
-          <w:color w:val="auto"/>
-          <w:sz w:val="22"/>
-          <w:szCs w:val="22"/>
-        </w:rPr>
-        <w:t>{{ practice.desarrollo }}</w:t>
+        <w:rPr/>
       </w:r>
     </w:p>
     <w:p>
@@ -4617,37 +4587,7 @@
         </w:rPr>
       </w:pPr>
       <w:r>
-        <w:rPr>
-          <w:rFonts w:cs="Arial" w:ascii="Arial" w:hAnsi="Arial"/>
-          <w:b w:val="false"/>
-          <w:sz w:val="22"/>
-          <w:szCs w:val="22"/>
-        </w:rPr>
-      </w:r>
-    </w:p>
-    <w:p>
-      <w:pPr>
-        <w:pStyle w:val="Normal"/>
-        <w:spacing w:lineRule="auto" w:line="276" w:before="0" w:after="200"/>
-        <w:contextualSpacing/>
-        <w:jc w:val="both"/>
-        <w:rPr>
-          <w:rFonts w:ascii="Arial" w:hAnsi="Arial" w:cs="Arial"/>
-          <w:b w:val="false"/>
-          <w:color w:val="FF0000"/>
-          <w:sz w:val="22"/>
-          <w:szCs w:val="22"/>
-        </w:rPr>
-      </w:pPr>
-      <w:r>
-        <w:rPr>
-          <w:rFonts w:cs="Arial" w:ascii="Arial" w:hAnsi="Arial"/>
-          <w:b w:val="false"/>
-          <w:color w:val="auto"/>
-          <w:sz w:val="22"/>
-          <w:szCs w:val="22"/>
-        </w:rPr>
-        <w:t>{{ practice.conclusiones }}</w:t>
+        <w:rPr/>
       </w:r>
     </w:p>
     <w:p>
@@ -5147,14 +5087,7 @@
         </w:rPr>
       </w:pPr>
       <w:r>
-        <w:rPr>
-          <w:rFonts w:cs="Arial" w:ascii="Arial" w:hAnsi="Arial"/>
-          <w:b w:val="false"/>
-          <w:color w:val="auto"/>
-          <w:sz w:val="22"/>
-          <w:szCs w:val="22"/>
-        </w:rPr>
-        <w:t>{{ practice.criterios }}</w:t>
+        <w:rPr/>
       </w:r>
     </w:p>
     <w:p>
@@ -5392,8 +5325,8 @@
                       <wps:cNvSpPr/>
                       <wps:spPr>
                         <a:xfrm>
-                          <a:off x="6540480" y="1216800"/>
-                          <a:ext cx="729720" cy="196920"/>
+                          <a:off x="6541200" y="1217160"/>
+                          <a:ext cx="729000" cy="196200"/>
                         </a:xfrm>
                         <a:prstGeom prst="rect">
                           <a:avLst/>
@@ -5449,8 +5382,8 @@
                       <wps:cNvSpPr/>
                       <wps:spPr>
                         <a:xfrm>
-                          <a:off x="1819440" y="897120"/>
-                          <a:ext cx="4941000" cy="350640"/>
+                          <a:off x="1819440" y="897840"/>
+                          <a:ext cx="4941000" cy="349920"/>
                         </a:xfrm>
                         <a:prstGeom prst="rect">
                           <a:avLst/>
@@ -5644,7 +5577,7 @@
                 </v:textbox>
                 <w10:wrap type="none"/>
               </v:rect>
-              <v:rect id="shape_0" stroked="f" o:allowincell="f" style="position:absolute;left:10675;top:15401;width:1148;height:309;mso-wrap-style:square;v-text-anchor:top">
+              <v:rect id="shape_0" stroked="f" o:allowincell="f" style="position:absolute;left:10676;top:15402;width:1147;height:308;mso-wrap-style:square;v-text-anchor:top">
                 <v:fill o:detectmouseclick="t" on="false"/>
                 <v:stroke color="#3465a4" weight="6480" joinstyle="round" endcap="flat"/>
                 <v:textbox>
@@ -5674,7 +5607,7 @@
                 </v:textbox>
                 <w10:wrap type="none"/>
               </v:rect>
-              <v:rect id="shape_0" stroked="f" o:allowincell="f" style="position:absolute;left:3240;top:14898;width:7780;height:551;mso-wrap-style:square;v-text-anchor:top">
+              <v:rect id="shape_0" stroked="f" o:allowincell="f" style="position:absolute;left:3240;top:14899;width:7780;height:550;mso-wrap-style:square;v-text-anchor:top">
                 <v:fill o:detectmouseclick="t" on="false"/>
                 <v:stroke color="#3465a4" weight="6480" joinstyle="round" endcap="flat"/>
                 <v:textbox>
@@ -5920,8 +5853,8 @@
                       <wps:cNvSpPr/>
                       <wps:spPr>
                         <a:xfrm>
-                          <a:off x="6540480" y="1216800"/>
-                          <a:ext cx="729720" cy="196920"/>
+                          <a:off x="6541200" y="1217160"/>
+                          <a:ext cx="729000" cy="196200"/>
                         </a:xfrm>
                         <a:prstGeom prst="rect">
                           <a:avLst/>
@@ -5977,8 +5910,8 @@
                       <wps:cNvSpPr/>
                       <wps:spPr>
                         <a:xfrm>
-                          <a:off x="1819440" y="897120"/>
-                          <a:ext cx="4941000" cy="350640"/>
+                          <a:off x="1819440" y="897840"/>
+                          <a:ext cx="4941000" cy="349920"/>
                         </a:xfrm>
                         <a:prstGeom prst="rect">
                           <a:avLst/>
@@ -6172,7 +6105,7 @@
                 </v:textbox>
                 <w10:wrap type="none"/>
               </v:rect>
-              <v:rect id="shape_0" stroked="f" o:allowincell="f" style="position:absolute;left:10675;top:15401;width:1148;height:309;mso-wrap-style:square;v-text-anchor:top">
+              <v:rect id="shape_0" stroked="f" o:allowincell="f" style="position:absolute;left:10676;top:15402;width:1147;height:308;mso-wrap-style:square;v-text-anchor:top">
                 <v:fill o:detectmouseclick="t" on="false"/>
                 <v:stroke color="#3465a4" weight="6480" joinstyle="round" endcap="flat"/>
                 <v:textbox>
@@ -6202,7 +6135,7 @@
                 </v:textbox>
                 <w10:wrap type="none"/>
               </v:rect>
-              <v:rect id="shape_0" stroked="f" o:allowincell="f" style="position:absolute;left:3240;top:14898;width:7780;height:551;mso-wrap-style:square;v-text-anchor:top">
+              <v:rect id="shape_0" stroked="f" o:allowincell="f" style="position:absolute;left:3240;top:14899;width:7780;height:550;mso-wrap-style:square;v-text-anchor:top">
                 <v:fill o:detectmouseclick="t" on="false"/>
                 <v:stroke color="#3465a4" weight="6480" joinstyle="round" endcap="flat"/>
                 <v:textbox>
@@ -6448,8 +6381,8 @@
                       <wps:cNvSpPr/>
                       <wps:spPr>
                         <a:xfrm>
-                          <a:off x="6540480" y="1216800"/>
-                          <a:ext cx="729720" cy="196920"/>
+                          <a:off x="6541200" y="1217160"/>
+                          <a:ext cx="729000" cy="196200"/>
                         </a:xfrm>
                         <a:prstGeom prst="rect">
                           <a:avLst/>
@@ -6505,8 +6438,8 @@
                       <wps:cNvSpPr/>
                       <wps:spPr>
                         <a:xfrm>
-                          <a:off x="1819440" y="897120"/>
-                          <a:ext cx="4941000" cy="350640"/>
+                          <a:off x="1819440" y="897840"/>
+                          <a:ext cx="4941000" cy="349920"/>
                         </a:xfrm>
                         <a:prstGeom prst="rect">
                           <a:avLst/>
@@ -6700,7 +6633,7 @@
                 </v:textbox>
                 <w10:wrap type="none"/>
               </v:rect>
-              <v:rect id="shape_0" stroked="f" o:allowincell="f" style="position:absolute;left:10675;top:15401;width:1148;height:309;mso-wrap-style:square;v-text-anchor:top">
+              <v:rect id="shape_0" stroked="f" o:allowincell="f" style="position:absolute;left:10676;top:15402;width:1147;height:308;mso-wrap-style:square;v-text-anchor:top">
                 <v:fill o:detectmouseclick="t" on="false"/>
                 <v:stroke color="#3465a4" weight="6480" joinstyle="round" endcap="flat"/>
                 <v:textbox>
@@ -6730,7 +6663,7 @@
                 </v:textbox>
                 <w10:wrap type="none"/>
               </v:rect>
-              <v:rect id="shape_0" stroked="f" o:allowincell="f" style="position:absolute;left:3240;top:14898;width:7780;height:551;mso-wrap-style:square;v-text-anchor:top">
+              <v:rect id="shape_0" stroked="f" o:allowincell="f" style="position:absolute;left:3240;top:14899;width:7780;height:550;mso-wrap-style:square;v-text-anchor:top">
                 <v:fill o:detectmouseclick="t" on="false"/>
                 <v:stroke color="#3465a4" weight="6480" joinstyle="round" endcap="flat"/>
                 <v:textbox>
@@ -6974,8 +6907,8 @@
                       <wps:cNvSpPr/>
                       <wps:spPr>
                         <a:xfrm>
-                          <a:off x="6540480" y="1216800"/>
-                          <a:ext cx="729720" cy="196920"/>
+                          <a:off x="6541200" y="1217160"/>
+                          <a:ext cx="729000" cy="196200"/>
                         </a:xfrm>
                         <a:prstGeom prst="rect">
                           <a:avLst/>
@@ -7031,8 +6964,8 @@
                       <wps:cNvSpPr/>
                       <wps:spPr>
                         <a:xfrm>
-                          <a:off x="1819440" y="897120"/>
-                          <a:ext cx="4941000" cy="350640"/>
+                          <a:off x="1819440" y="897840"/>
+                          <a:ext cx="4941000" cy="349920"/>
                         </a:xfrm>
                         <a:prstGeom prst="rect">
                           <a:avLst/>
@@ -7224,7 +7157,7 @@
                 </v:textbox>
                 <w10:wrap type="none"/>
               </v:rect>
-              <v:rect id="shape_0" stroked="f" o:allowincell="f" style="position:absolute;left:10675;top:15401;width:1148;height:309;mso-wrap-style:square;v-text-anchor:top">
+              <v:rect id="shape_0" stroked="f" o:allowincell="f" style="position:absolute;left:10676;top:15402;width:1147;height:308;mso-wrap-style:square;v-text-anchor:top">
                 <v:fill o:detectmouseclick="t" on="false"/>
                 <v:stroke color="#3465a4" weight="6480" joinstyle="round" endcap="flat"/>
                 <v:textbox>
@@ -7254,7 +7187,7 @@
                 </v:textbox>
                 <w10:wrap type="none"/>
               </v:rect>
-              <v:rect id="shape_0" stroked="f" o:allowincell="f" style="position:absolute;left:3240;top:14898;width:7780;height:551;mso-wrap-style:square;v-text-anchor:top">
+              <v:rect id="shape_0" stroked="f" o:allowincell="f" style="position:absolute;left:3240;top:14899;width:7780;height:550;mso-wrap-style:square;v-text-anchor:top">
                 <v:fill o:detectmouseclick="t" on="false"/>
                 <v:stroke color="#3465a4" weight="6480" joinstyle="round" endcap="flat"/>
                 <v:textbox>
@@ -7498,8 +7431,8 @@
                       <wps:cNvSpPr/>
                       <wps:spPr>
                         <a:xfrm>
-                          <a:off x="6540480" y="1216800"/>
-                          <a:ext cx="729720" cy="196920"/>
+                          <a:off x="6541200" y="1217160"/>
+                          <a:ext cx="729000" cy="196200"/>
                         </a:xfrm>
                         <a:prstGeom prst="rect">
                           <a:avLst/>
@@ -7555,8 +7488,8 @@
                       <wps:cNvSpPr/>
                       <wps:spPr>
                         <a:xfrm>
-                          <a:off x="1819440" y="897120"/>
-                          <a:ext cx="4941000" cy="350640"/>
+                          <a:off x="1819440" y="897840"/>
+                          <a:ext cx="4941000" cy="349920"/>
                         </a:xfrm>
                         <a:prstGeom prst="rect">
                           <a:avLst/>
@@ -7748,7 +7681,7 @@
                 </v:textbox>
                 <w10:wrap type="none"/>
               </v:rect>
-              <v:rect id="shape_0" stroked="f" o:allowincell="f" style="position:absolute;left:10189;top:14585;width:1148;height:309;mso-wrap-style:square;v-text-anchor:top">
+              <v:rect id="shape_0" stroked="f" o:allowincell="f" style="position:absolute;left:10190;top:14586;width:1147;height:308;mso-wrap-style:square;v-text-anchor:top">
                 <v:fill o:detectmouseclick="t" on="false"/>
                 <v:stroke color="#3465a4" weight="6480" joinstyle="round" endcap="flat"/>
                 <v:textbox>
@@ -7778,7 +7711,7 @@
                 </v:textbox>
                 <w10:wrap type="none"/>
               </v:rect>
-              <v:rect id="shape_0" stroked="f" o:allowincell="f" style="position:absolute;left:2754;top:14082;width:7780;height:551;mso-wrap-style:square;v-text-anchor:top">
+              <v:rect id="shape_0" stroked="f" o:allowincell="f" style="position:absolute;left:2754;top:14083;width:7780;height:550;mso-wrap-style:square;v-text-anchor:top">
                 <v:fill o:detectmouseclick="t" on="false"/>
                 <v:stroke color="#3465a4" weight="6480" joinstyle="round" endcap="flat"/>
                 <v:textbox>
@@ -8044,8 +7977,8 @@
                       <wps:cNvSpPr/>
                       <wps:spPr>
                         <a:xfrm>
-                          <a:off x="6540480" y="1216800"/>
-                          <a:ext cx="729720" cy="196920"/>
+                          <a:off x="6541200" y="1217160"/>
+                          <a:ext cx="729000" cy="196200"/>
                         </a:xfrm>
                         <a:prstGeom prst="rect">
                           <a:avLst/>
@@ -8101,8 +8034,8 @@
                       <wps:cNvSpPr/>
                       <wps:spPr>
                         <a:xfrm>
-                          <a:off x="1819440" y="897120"/>
-                          <a:ext cx="4941000" cy="350640"/>
+                          <a:off x="1819440" y="897840"/>
+                          <a:ext cx="4941000" cy="349920"/>
                         </a:xfrm>
                         <a:prstGeom prst="rect">
                           <a:avLst/>
@@ -8296,7 +8229,7 @@
                 </v:textbox>
                 <w10:wrap type="none"/>
               </v:rect>
-              <v:rect id="shape_0" stroked="f" o:allowincell="f" style="position:absolute;left:10675;top:15401;width:1148;height:309;mso-wrap-style:square;v-text-anchor:top">
+              <v:rect id="shape_0" stroked="f" o:allowincell="f" style="position:absolute;left:10676;top:15402;width:1147;height:308;mso-wrap-style:square;v-text-anchor:top">
                 <v:fill o:detectmouseclick="t" on="false"/>
                 <v:stroke color="#3465a4" weight="6480" joinstyle="round" endcap="flat"/>
                 <v:textbox>
@@ -8326,7 +8259,7 @@
                 </v:textbox>
                 <w10:wrap type="none"/>
               </v:rect>
-              <v:rect id="shape_0" stroked="f" o:allowincell="f" style="position:absolute;left:3240;top:14898;width:7780;height:551;mso-wrap-style:square;v-text-anchor:top">
+              <v:rect id="shape_0" stroked="f" o:allowincell="f" style="position:absolute;left:3240;top:14899;width:7780;height:550;mso-wrap-style:square;v-text-anchor:top">
                 <v:fill o:detectmouseclick="t" on="false"/>
                 <v:stroke color="#3465a4" weight="6480" joinstyle="round" endcap="flat"/>
                 <v:textbox>
@@ -8572,8 +8505,8 @@
                       <wps:cNvSpPr/>
                       <wps:spPr>
                         <a:xfrm>
-                          <a:off x="6540480" y="1216800"/>
-                          <a:ext cx="729720" cy="196920"/>
+                          <a:off x="6541200" y="1217160"/>
+                          <a:ext cx="729000" cy="196200"/>
                         </a:xfrm>
                         <a:prstGeom prst="rect">
                           <a:avLst/>
@@ -8629,8 +8562,8 @@
                       <wps:cNvSpPr/>
                       <wps:spPr>
                         <a:xfrm>
-                          <a:off x="1819440" y="897120"/>
-                          <a:ext cx="4941000" cy="350640"/>
+                          <a:off x="1819440" y="897840"/>
+                          <a:ext cx="4941000" cy="349920"/>
                         </a:xfrm>
                         <a:prstGeom prst="rect">
                           <a:avLst/>
@@ -8824,7 +8757,7 @@
                 </v:textbox>
                 <w10:wrap type="none"/>
               </v:rect>
-              <v:rect id="shape_0" stroked="f" o:allowincell="f" style="position:absolute;left:10675;top:15401;width:1148;height:309;mso-wrap-style:square;v-text-anchor:top">
+              <v:rect id="shape_0" stroked="f" o:allowincell="f" style="position:absolute;left:10676;top:15402;width:1147;height:308;mso-wrap-style:square;v-text-anchor:top">
                 <v:fill o:detectmouseclick="t" on="false"/>
                 <v:stroke color="#3465a4" weight="6480" joinstyle="round" endcap="flat"/>
                 <v:textbox>
@@ -8854,7 +8787,7 @@
                 </v:textbox>
                 <w10:wrap type="none"/>
               </v:rect>
-              <v:rect id="shape_0" stroked="f" o:allowincell="f" style="position:absolute;left:3240;top:14898;width:7780;height:551;mso-wrap-style:square;v-text-anchor:top">
+              <v:rect id="shape_0" stroked="f" o:allowincell="f" style="position:absolute;left:3240;top:14899;width:7780;height:550;mso-wrap-style:square;v-text-anchor:top">
                 <v:fill o:detectmouseclick="t" on="false"/>
                 <v:stroke color="#3465a4" weight="6480" joinstyle="round" endcap="flat"/>
                 <v:textbox>
@@ -9100,8 +9033,8 @@
                       <wps:cNvSpPr/>
                       <wps:spPr>
                         <a:xfrm>
-                          <a:off x="6540480" y="1216800"/>
-                          <a:ext cx="729720" cy="196920"/>
+                          <a:off x="6541200" y="1217160"/>
+                          <a:ext cx="729000" cy="196200"/>
                         </a:xfrm>
                         <a:prstGeom prst="rect">
                           <a:avLst/>
@@ -9157,8 +9090,8 @@
                       <wps:cNvSpPr/>
                       <wps:spPr>
                         <a:xfrm>
-                          <a:off x="1819440" y="897120"/>
-                          <a:ext cx="4941000" cy="350640"/>
+                          <a:off x="1819440" y="897840"/>
+                          <a:ext cx="4941000" cy="349920"/>
                         </a:xfrm>
                         <a:prstGeom prst="rect">
                           <a:avLst/>
@@ -9352,7 +9285,7 @@
                 </v:textbox>
                 <w10:wrap type="none"/>
               </v:rect>
-              <v:rect id="shape_0" stroked="f" o:allowincell="f" style="position:absolute;left:10675;top:15401;width:1148;height:309;mso-wrap-style:square;v-text-anchor:top">
+              <v:rect id="shape_0" stroked="f" o:allowincell="f" style="position:absolute;left:10676;top:15402;width:1147;height:308;mso-wrap-style:square;v-text-anchor:top">
                 <v:fill o:detectmouseclick="t" on="false"/>
                 <v:stroke color="#3465a4" weight="6480" joinstyle="round" endcap="flat"/>
                 <v:textbox>
@@ -9382,7 +9315,7 @@
                 </v:textbox>
                 <w10:wrap type="none"/>
               </v:rect>
-              <v:rect id="shape_0" stroked="f" o:allowincell="f" style="position:absolute;left:3240;top:14898;width:7780;height:551;mso-wrap-style:square;v-text-anchor:top">
+              <v:rect id="shape_0" stroked="f" o:allowincell="f" style="position:absolute;left:3240;top:14899;width:7780;height:550;mso-wrap-style:square;v-text-anchor:top">
                 <v:fill o:detectmouseclick="t" on="false"/>
                 <v:stroke color="#3465a4" weight="6480" joinstyle="round" endcap="flat"/>
                 <v:textbox>
@@ -9626,8 +9559,8 @@
                       <wps:cNvSpPr/>
                       <wps:spPr>
                         <a:xfrm>
-                          <a:off x="6540480" y="1216800"/>
-                          <a:ext cx="729720" cy="196920"/>
+                          <a:off x="6541200" y="1217160"/>
+                          <a:ext cx="729000" cy="196200"/>
                         </a:xfrm>
                         <a:prstGeom prst="rect">
                           <a:avLst/>
@@ -9683,8 +9616,8 @@
                       <wps:cNvSpPr/>
                       <wps:spPr>
                         <a:xfrm>
-                          <a:off x="1819440" y="897120"/>
-                          <a:ext cx="4941000" cy="350640"/>
+                          <a:off x="1819440" y="897840"/>
+                          <a:ext cx="4941000" cy="349920"/>
                         </a:xfrm>
                         <a:prstGeom prst="rect">
                           <a:avLst/>
@@ -9876,7 +9809,7 @@
                 </v:textbox>
                 <w10:wrap type="none"/>
               </v:rect>
-              <v:rect id="shape_0" stroked="f" o:allowincell="f" style="position:absolute;left:10675;top:15401;width:1148;height:309;mso-wrap-style:square;v-text-anchor:top">
+              <v:rect id="shape_0" stroked="f" o:allowincell="f" style="position:absolute;left:10676;top:15402;width:1147;height:308;mso-wrap-style:square;v-text-anchor:top">
                 <v:fill o:detectmouseclick="t" on="false"/>
                 <v:stroke color="#3465a4" weight="6480" joinstyle="round" endcap="flat"/>
                 <v:textbox>
@@ -9906,7 +9839,7 @@
                 </v:textbox>
                 <w10:wrap type="none"/>
               </v:rect>
-              <v:rect id="shape_0" stroked="f" o:allowincell="f" style="position:absolute;left:3240;top:14898;width:7780;height:551;mso-wrap-style:square;v-text-anchor:top">
+              <v:rect id="shape_0" stroked="f" o:allowincell="f" style="position:absolute;left:3240;top:14899;width:7780;height:550;mso-wrap-style:square;v-text-anchor:top">
                 <v:fill o:detectmouseclick="t" on="false"/>
                 <v:stroke color="#3465a4" weight="6480" joinstyle="round" endcap="flat"/>
                 <v:textbox>
@@ -10150,8 +10083,8 @@
                       <wps:cNvSpPr/>
                       <wps:spPr>
                         <a:xfrm>
-                          <a:off x="6540480" y="1216800"/>
-                          <a:ext cx="729720" cy="196920"/>
+                          <a:off x="6541200" y="1217160"/>
+                          <a:ext cx="729000" cy="196200"/>
                         </a:xfrm>
                         <a:prstGeom prst="rect">
                           <a:avLst/>
@@ -10207,8 +10140,8 @@
                       <wps:cNvSpPr/>
                       <wps:spPr>
                         <a:xfrm>
-                          <a:off x="1819440" y="897120"/>
-                          <a:ext cx="4941000" cy="350640"/>
+                          <a:off x="1819440" y="897840"/>
+                          <a:ext cx="4941000" cy="349920"/>
                         </a:xfrm>
                         <a:prstGeom prst="rect">
                           <a:avLst/>
@@ -10400,7 +10333,7 @@
                 </v:textbox>
                 <w10:wrap type="none"/>
               </v:rect>
-              <v:rect id="shape_0" stroked="f" o:allowincell="f" style="position:absolute;left:10189;top:14585;width:1148;height:309;mso-wrap-style:square;v-text-anchor:top">
+              <v:rect id="shape_0" stroked="f" o:allowincell="f" style="position:absolute;left:10190;top:14586;width:1147;height:308;mso-wrap-style:square;v-text-anchor:top">
                 <v:fill o:detectmouseclick="t" on="false"/>
                 <v:stroke color="#3465a4" weight="6480" joinstyle="round" endcap="flat"/>
                 <v:textbox>
@@ -10430,7 +10363,7 @@
                 </v:textbox>
                 <w10:wrap type="none"/>
               </v:rect>
-              <v:rect id="shape_0" stroked="f" o:allowincell="f" style="position:absolute;left:2754;top:14082;width:7780;height:551;mso-wrap-style:square;v-text-anchor:top">
+              <v:rect id="shape_0" stroked="f" o:allowincell="f" style="position:absolute;left:2754;top:14083;width:7780;height:550;mso-wrap-style:square;v-text-anchor:top">
                 <v:fill o:detectmouseclick="t" on="false"/>
                 <v:stroke color="#3465a4" weight="6480" joinstyle="round" endcap="flat"/>
                 <v:textbox>
@@ -10590,7 +10523,7 @@
                       <pic:spPr>
                         <a:xfrm>
                           <a:off x="0" y="50760"/>
-                          <a:ext cx="1776240" cy="590400"/>
+                          <a:ext cx="1775520" cy="590400"/>
                         </a:xfrm>
                         <a:prstGeom prst="rect">
                           <a:avLst/>
@@ -10612,8 +10545,8 @@
                       </pic:blipFill>
                       <pic:spPr>
                         <a:xfrm>
-                          <a:off x="6250320" y="0"/>
-                          <a:ext cx="734760" cy="704880"/>
+                          <a:off x="6251040" y="0"/>
+                          <a:ext cx="734040" cy="704880"/>
                         </a:xfrm>
                         <a:prstGeom prst="rect">
                           <a:avLst/>
@@ -10652,12 +10585,12 @@
                 <v:path o:extrusionok="f" gradientshapeok="t" o:connecttype="rect"/>
                 <o:lock v:ext="edit" aspectratio="t"/>
               </v:shapetype>
-              <v:shape id="shape_0" stroked="f" o:allowincell="f" style="position:absolute;left:-504;top:166;width:2796;height:929;mso-wrap-style:none;v-text-anchor:middle" type="_x0000_t75">
+              <v:shape id="shape_0" stroked="f" o:allowincell="f" style="position:absolute;left:-504;top:166;width:2795;height:929;mso-wrap-style:none;v-text-anchor:middle" type="_x0000_t75">
                 <v:imagedata r:id="rId3" o:detectmouseclick="t"/>
                 <v:stroke color="#3465a4" joinstyle="round" endcap="flat"/>
                 <w10:wrap type="none"/>
               </v:shape>
-              <v:shape id="shape_0" stroked="f" o:allowincell="f" style="position:absolute;left:9339;top:86;width:1156;height:1109;mso-wrap-style:none;v-text-anchor:middle" type="_x0000_t75">
+              <v:shape id="shape_0" stroked="f" o:allowincell="f" style="position:absolute;left:9340;top:86;width:1155;height:1109;mso-wrap-style:none;v-text-anchor:middle" type="_x0000_t75">
                 <v:imagedata r:id="rId4" o:detectmouseclick="t"/>
                 <v:stroke color="#3465a4" joinstyle="round" endcap="flat"/>
                 <w10:wrap type="none"/>
@@ -10719,7 +10652,7 @@
                       <pic:spPr>
                         <a:xfrm>
                           <a:off x="0" y="50760"/>
-                          <a:ext cx="1776240" cy="590400"/>
+                          <a:ext cx="1775520" cy="590400"/>
                         </a:xfrm>
                         <a:prstGeom prst="rect">
                           <a:avLst/>
@@ -10741,8 +10674,8 @@
                       </pic:blipFill>
                       <pic:spPr>
                         <a:xfrm>
-                          <a:off x="6250320" y="0"/>
-                          <a:ext cx="734760" cy="704880"/>
+                          <a:off x="6251040" y="0"/>
+                          <a:ext cx="734040" cy="704880"/>
                         </a:xfrm>
                         <a:prstGeom prst="rect">
                           <a:avLst/>
@@ -10762,12 +10695,12 @@
         <mc:Fallback>
           <w:pict>
             <v:group id="shape_0" alt="Grupo 32" style="position:absolute;margin-left:-25.2pt;margin-top:4.3pt;width:550pt;height:55.5pt" coordorigin="-504,86" coordsize="11000,1110">
-              <v:shape id="shape_0" stroked="f" o:allowincell="f" style="position:absolute;left:-504;top:166;width:2796;height:929;mso-wrap-style:none;v-text-anchor:middle" type="_x0000_t75">
+              <v:shape id="shape_0" stroked="f" o:allowincell="f" style="position:absolute;left:-504;top:166;width:2795;height:929;mso-wrap-style:none;v-text-anchor:middle" type="_x0000_t75">
                 <v:imagedata r:id="rId3" o:detectmouseclick="t"/>
                 <v:stroke color="#3465a4" joinstyle="round" endcap="flat"/>
                 <w10:wrap type="none"/>
               </v:shape>
-              <v:shape id="shape_0" stroked="f" o:allowincell="f" style="position:absolute;left:9339;top:86;width:1156;height:1109;mso-wrap-style:none;v-text-anchor:middle" type="_x0000_t75">
+              <v:shape id="shape_0" stroked="f" o:allowincell="f" style="position:absolute;left:9340;top:86;width:1155;height:1109;mso-wrap-style:none;v-text-anchor:middle" type="_x0000_t75">
                 <v:imagedata r:id="rId4" o:detectmouseclick="t"/>
                 <v:stroke color="#3465a4" joinstyle="round" endcap="flat"/>
                 <w10:wrap type="none"/>
@@ -11299,15 +11232,15 @@
       <w:rFonts w:cs="Lucida Sans"/>
     </w:rPr>
   </w:style>
-  <w:style w:type="paragraph" w:styleId="Cabeceraypie">
-    <w:name w:val="Cabecera y pie"/>
+  <w:style w:type="paragraph" w:styleId="Cabeceraypieuser">
+    <w:name w:val="Cabecera y pie (user)"/>
     <w:basedOn w:val="Normal"/>
     <w:qFormat/>
     <w:pPr/>
     <w:rPr/>
   </w:style>
-  <w:style w:type="paragraph" w:styleId="Cabeceraypieuser">
-    <w:name w:val="Cabecera y pie (user)"/>
+  <w:style w:type="paragraph" w:styleId="Cabeceraypie">
+    <w:name w:val="Cabecera y pie"/>
     <w:basedOn w:val="Normal"/>
     <w:qFormat/>
     <w:pPr/>
@@ -11405,6 +11338,13 @@
       <w:szCs w:val="20"/>
     </w:rPr>
   </w:style>
+  <w:style w:type="paragraph" w:styleId="Contenidodelmarcouser">
+    <w:name w:val="Contenido del marco (user)"/>
+    <w:basedOn w:val="Normal"/>
+    <w:qFormat/>
+    <w:pPr/>
+    <w:rPr/>
+  </w:style>
   <w:style w:type="paragraph" w:styleId="Contenidodelmarco">
     <w:name w:val="Contenido del marco"/>
     <w:basedOn w:val="Normal"/>
@@ -11412,15 +11352,8 @@
     <w:pPr/>
     <w:rPr/>
   </w:style>
-  <w:style w:type="paragraph" w:styleId="Contenidodelmarcouser">
-    <w:name w:val="Contenido del marco (user)"/>
-    <w:basedOn w:val="Normal"/>
-    <w:qFormat/>
-    <w:pPr/>
-    <w:rPr/>
-  </w:style>
-  <w:style w:type="numbering" w:styleId="Ningunalista" w:default="1">
-    <w:name w:val="Ninguna lista"/>
+  <w:style w:type="numbering" w:styleId="Ningunalistauser" w:default="1">
+    <w:name w:val="Ninguna lista (user)"/>
     <w:uiPriority w:val="99"/>
     <w:semiHidden/>
     <w:unhideWhenUsed/>

</xml_diff>

<commit_message>
Deberia añadir commits mas seguido
</commit_message>
<xml_diff>
--- a/template.docx
+++ b/template.docx
@@ -1209,7 +1209,19 @@
                 <w:szCs w:val="22"/>
                 <w:lang w:val="es-MX" w:eastAsia="es-MX" w:bidi="ar-SA"/>
               </w:rPr>
-              <w:t>{% for practice in practicas %} Práctica No. {{ practice.numero }}</w:t>
+              <w:t>{%tr for practica in practicas %}</w:t>
+            </w:r>
+            <w:r>
+              <w:rPr>
+                <w:rFonts w:eastAsia="Times New Roman" w:cs="Arial" w:ascii="Arial" w:hAnsi="Arial"/>
+                <w:b/>
+                <w:bCs/>
+                <w:kern w:val="0"/>
+                <w:sz w:val="22"/>
+                <w:szCs w:val="22"/>
+                <w:lang w:val="es-MX" w:eastAsia="es-MX" w:bidi="ar-SA"/>
+              </w:rPr>
+              <w:t xml:space="preserve"> Práctica No. {{ practica.numero }}</w:t>
             </w:r>
           </w:p>
         </w:tc>
@@ -1316,7 +1328,7 @@
                 <w:szCs w:val="22"/>
                 <w:lang w:val="es-MX" w:eastAsia="es-MX" w:bidi="ar-SA"/>
               </w:rPr>
-              <w:t>{{ practice.nombre }}…………….…………………………………………………</w:t>
+              <w:t>{{ practica.nombre }}…………….…………………………………………………</w:t>
             </w:r>
           </w:p>
         </w:tc>
@@ -1350,6 +1362,9 @@
                 <w:sz w:val="22"/>
                 <w:szCs w:val="22"/>
               </w:rPr>
+            </w:r>
+            <w:r>
+              <w:t>{%tr endfor %}</w:t>
             </w:r>
           </w:p>
         </w:tc>
@@ -1475,23 +1490,6 @@
           <w:rFonts w:cs="Calibri" w:ascii="Calibri" w:hAnsi="Calibri"/>
           <w:b w:val="false"/>
         </w:rPr>
-        <w:t>{% endfor %}</w:t>
-      </w:r>
-    </w:p>
-    <w:p>
-      <w:pPr>
-        <w:pStyle w:val="Normal"/>
-        <w:jc w:val="center"/>
-        <w:rPr>
-          <w:rFonts w:ascii="Calibri" w:hAnsi="Calibri" w:cs="Calibri"/>
-          <w:b w:val="false"/>
-        </w:rPr>
-      </w:pPr>
-      <w:r>
-        <w:rPr>
-          <w:rFonts w:cs="Calibri" w:ascii="Calibri" w:hAnsi="Calibri"/>
-          <w:b w:val="false"/>
-        </w:rPr>
       </w:r>
     </w:p>
     <w:p>
@@ -3601,7 +3599,7 @@
       </w:pPr>
       <w:r>
         <w:rPr/>
-        <w:t>{% for practice in practicas %}</w:t>
+        <w:t>{% for practica in practicas %}</w:t>
       </w:r>
     </w:p>
     <w:p>
@@ -3647,7 +3645,7 @@
           <w:sz w:val="26"/>
           <w:szCs w:val="26"/>
         </w:rPr>
-        <w:t>PRÁCTICA NO. {{ practice.numero }}</w:t>
+        <w:t>PRÁCTICA NO. {{ practica.numero }}</w:t>
       </w:r>
     </w:p>
     <w:p>
@@ -3814,7 +3812,7 @@
           <w:sz w:val="22"/>
           <w:szCs w:val="22"/>
         </w:rPr>
-        <w:t>{{ practice.competencia }}</w:t>
+        <w:t>{{ practica.competencia }}</w:t>
       </w:r>
     </w:p>
     <w:p>
@@ -3981,7 +3979,7 @@
           <w:sz w:val="22"/>
           <w:szCs w:val="22"/>
         </w:rPr>
-        <w:t>{{ practice.material }}</w:t>
+        <w:t>{{ practica.material }}</w:t>
       </w:r>
     </w:p>
     <w:p>
@@ -4148,7 +4146,7 @@
           <w:sz w:val="22"/>
           <w:szCs w:val="22"/>
         </w:rPr>
-        <w:t>{{ practice.marco_teorico }}</w:t>
+        <w:t>{{ practica.marco_teorico }}</w:t>
       </w:r>
     </w:p>
     <w:p>
@@ -4450,7 +4448,7 @@
           <w:sz w:val="22"/>
           <w:szCs w:val="22"/>
         </w:rPr>
-        <w:t>{{ practice.cuestionario }}</w:t>
+        <w:t>{{ practica.cuestionario }}</w:t>
       </w:r>
     </w:p>
     <w:p>
@@ -4756,7 +4754,7 @@
           <w:sz w:val="22"/>
           <w:szCs w:val="22"/>
         </w:rPr>
-        <w:t>{{ practice.aplicaciones }}</w:t>
+        <w:t>{{ practica.aplicaciones }}</w:t>
       </w:r>
     </w:p>
     <w:p>
@@ -4923,7 +4921,7 @@
           <w:sz w:val="22"/>
           <w:szCs w:val="22"/>
         </w:rPr>
-        <w:t>{{ practice.referencias }}</w:t>
+        <w:t>{{ practica.referencias }}</w:t>
       </w:r>
     </w:p>
     <w:p>

</xml_diff>